<commit_message>
Word docx and dotm updated.
Macros were missing in dotm.
Updated and tested via SAP Automation.
EditAddress dialog working, data present.
</commit_message>
<xml_diff>
--- a/PaArztBrief_Version72.docx
+++ b/PaArztBrief_Version72.docx
@@ -9,6 +9,8 @@
           <w:b/>
         </w:rPr>
       </w:pPr>
+      <w:bookmarkStart w:id="0" w:name="_GoBack"/>
+      <w:bookmarkEnd w:id="0"/>
       <w:r>
         <w:rPr>
           <w:b/>
@@ -76,7 +78,6 @@
                                 </w:tcPr>
                                 <w:p>
                                   <w:pPr>
-                                    <w:spacing w:line="259" w:lineRule="auto"/>
                                     <w:rPr>
                                       <w:rFonts w:cs="Arial"/>
                                       <w:sz w:val="15"/>
@@ -129,7 +130,6 @@
                                 </w:tcPr>
                                 <w:p>
                                   <w:pPr>
-                                    <w:spacing w:line="259" w:lineRule="auto"/>
                                     <w:rPr>
                                       <w:rFonts w:cs="Arial"/>
                                       <w:sz w:val="15"/>
@@ -167,7 +167,6 @@
                                 </w:tcPr>
                                 <w:p>
                                   <w:pPr>
-                                    <w:spacing w:line="259" w:lineRule="auto"/>
                                     <w:rPr>
                                       <w:rFonts w:cs="Arial"/>
                                       <w:sz w:val="15"/>
@@ -191,7 +190,6 @@
                                 </w:tcPr>
                                 <w:p>
                                   <w:pPr>
-                                    <w:spacing w:line="259" w:lineRule="auto"/>
                                     <w:rPr>
                                       <w:rFonts w:cs="Arial"/>
                                       <w:sz w:val="15"/>
@@ -217,7 +215,6 @@
                                 </w:tcPr>
                                 <w:p>
                                   <w:pPr>
-                                    <w:spacing w:line="259" w:lineRule="auto"/>
                                     <w:rPr>
                                       <w:rFonts w:cs="Arial"/>
                                       <w:sz w:val="15"/>
@@ -235,7 +232,6 @@
                                 </w:p>
                                 <w:p>
                                   <w:pPr>
-                                    <w:spacing w:line="259" w:lineRule="auto"/>
                                     <w:rPr>
                                       <w:rFonts w:cs="Arial"/>
                                       <w:sz w:val="15"/>
@@ -259,7 +255,6 @@
                                 </w:tcPr>
                                 <w:p>
                                   <w:pPr>
-                                    <w:spacing w:line="259" w:lineRule="auto"/>
                                     <w:rPr>
                                       <w:rFonts w:cs="Arial"/>
                                       <w:sz w:val="15"/>
@@ -296,7 +291,6 @@
                                 </w:p>
                                 <w:p>
                                   <w:pPr>
-                                    <w:spacing w:line="259" w:lineRule="auto"/>
                                     <w:rPr>
                                       <w:rFonts w:cs="Arial"/>
                                       <w:sz w:val="15"/>
@@ -321,9 +315,9 @@
                                 <w:sz w:val="15"/>
                                 <w:szCs w:val="15"/>
                               </w:rPr>
-                              <w:t xml:space="preserve">Berlin,  </w:t>
+                              <w:t xml:space="preserve">Berlin, </w:t>
                             </w:r>
-                            <w:bookmarkStart w:id="0" w:name="AUTODATE"/>
+                            <w:bookmarkStart w:id="1" w:name="AUTODATE"/>
                             <w:proofErr w:type="spellStart"/>
                             <w:r>
                               <w:rPr>
@@ -333,7 +327,7 @@
                               </w:rPr>
                               <w:t>dd.mm.yyyy</w:t>
                             </w:r>
-                            <w:bookmarkEnd w:id="0"/>
+                            <w:bookmarkEnd w:id="1"/>
                             <w:proofErr w:type="spellEnd"/>
                             <w:r>
                               <w:rPr>
@@ -388,7 +382,6 @@
                           </w:tcPr>
                           <w:p>
                             <w:pPr>
-                              <w:spacing w:line="259" w:lineRule="auto"/>
                               <w:rPr>
                                 <w:rFonts w:cs="Arial"/>
                                 <w:sz w:val="15"/>
@@ -441,7 +434,6 @@
                           </w:tcPr>
                           <w:p>
                             <w:pPr>
-                              <w:spacing w:line="259" w:lineRule="auto"/>
                               <w:rPr>
                                 <w:rFonts w:cs="Arial"/>
                                 <w:sz w:val="15"/>
@@ -479,7 +471,6 @@
                           </w:tcPr>
                           <w:p>
                             <w:pPr>
-                              <w:spacing w:line="259" w:lineRule="auto"/>
                               <w:rPr>
                                 <w:rFonts w:cs="Arial"/>
                                 <w:sz w:val="15"/>
@@ -503,7 +494,6 @@
                           </w:tcPr>
                           <w:p>
                             <w:pPr>
-                              <w:spacing w:line="259" w:lineRule="auto"/>
                               <w:rPr>
                                 <w:rFonts w:cs="Arial"/>
                                 <w:sz w:val="15"/>
@@ -529,7 +519,6 @@
                           </w:tcPr>
                           <w:p>
                             <w:pPr>
-                              <w:spacing w:line="259" w:lineRule="auto"/>
                               <w:rPr>
                                 <w:rFonts w:cs="Arial"/>
                                 <w:sz w:val="15"/>
@@ -547,7 +536,6 @@
                           </w:p>
                           <w:p>
                             <w:pPr>
-                              <w:spacing w:line="259" w:lineRule="auto"/>
                               <w:rPr>
                                 <w:rFonts w:cs="Arial"/>
                                 <w:sz w:val="15"/>
@@ -571,7 +559,6 @@
                           </w:tcPr>
                           <w:p>
                             <w:pPr>
-                              <w:spacing w:line="259" w:lineRule="auto"/>
                               <w:rPr>
                                 <w:rFonts w:cs="Arial"/>
                                 <w:sz w:val="15"/>
@@ -608,7 +595,6 @@
                           </w:p>
                           <w:p>
                             <w:pPr>
-                              <w:spacing w:line="259" w:lineRule="auto"/>
                               <w:rPr>
                                 <w:rFonts w:cs="Arial"/>
                                 <w:sz w:val="15"/>
@@ -633,9 +619,9 @@
                           <w:sz w:val="15"/>
                           <w:szCs w:val="15"/>
                         </w:rPr>
-                        <w:t xml:space="preserve">Berlin,  </w:t>
+                        <w:t xml:space="preserve">Berlin, </w:t>
                       </w:r>
-                      <w:bookmarkStart w:id="1" w:name="AUTODATE"/>
+                      <w:bookmarkStart w:id="2" w:name="AUTODATE"/>
                       <w:proofErr w:type="spellStart"/>
                       <w:r>
                         <w:rPr>
@@ -645,7 +631,7 @@
                         </w:rPr>
                         <w:t>dd.mm.yyyy</w:t>
                       </w:r>
-                      <w:bookmarkEnd w:id="1"/>
+                      <w:bookmarkEnd w:id="2"/>
                       <w:proofErr w:type="spellEnd"/>
                       <w:r>
                         <w:rPr>
@@ -760,13 +746,6 @@
           <w:rFonts w:ascii="Arial" w:hAnsi="Arial"/>
           <w:sz w:val="20"/>
         </w:rPr>
-        <w:t xml:space="preserve"> </w:t>
-      </w:r>
-      <w:r>
-        <w:rPr>
-          <w:rFonts w:ascii="Arial" w:hAnsi="Arial"/>
-          <w:sz w:val="20"/>
-        </w:rPr>
         <w:fldChar w:fldCharType="begin">
           <w:ffData>
             <w:name w:val="NAMEERST"/>
@@ -865,7 +844,7 @@
           </w:ffData>
         </w:fldChar>
       </w:r>
-      <w:bookmarkStart w:id="3" w:name="STRASSERST"/>
+      <w:bookmarkStart w:id="4" w:name="STRASSERST"/>
       <w:r>
         <w:rPr>
           <w:rFonts w:ascii="Arial" w:hAnsi="Arial"/>
@@ -933,7 +912,7 @@
         </w:rPr>
         <w:fldChar w:fldCharType="end"/>
       </w:r>
-      <w:bookmarkEnd w:id="3"/>
+      <w:bookmarkEnd w:id="4"/>
       <w:r>
         <w:rPr>
           <w:rFonts w:ascii="Arial" w:hAnsi="Arial"/>
@@ -970,13 +949,6 @@
           <w:sz w:val="20"/>
         </w:rPr>
       </w:pPr>
-      <w:r>
-        <w:rPr>
-          <w:rFonts w:ascii="Arial" w:hAnsi="Arial"/>
-          <w:sz w:val="20"/>
-        </w:rPr>
-        <w:t xml:space="preserve"> </w:t>
-      </w:r>
       <w:r>
         <w:rPr>
           <w:rFonts w:ascii="Arial" w:hAnsi="Arial"/>
@@ -1079,7 +1051,7 @@
           </w:ffData>
         </w:fldChar>
       </w:r>
-      <w:bookmarkStart w:id="4" w:name="ORTERST"/>
+      <w:bookmarkStart w:id="5" w:name="ORTERST"/>
       <w:r>
         <w:rPr>
           <w:rFonts w:ascii="Arial" w:hAnsi="Arial"/>
@@ -1147,8 +1119,6 @@
         </w:rPr>
         <w:fldChar w:fldCharType="end"/>
       </w:r>
-      <w:bookmarkStart w:id="5" w:name="_GoBack"/>
-      <w:bookmarkEnd w:id="4"/>
       <w:bookmarkEnd w:id="5"/>
     </w:p>
     <w:p>
@@ -1894,25 +1864,7 @@
           <w:bCs/>
           <w:sz w:val="20"/>
         </w:rPr>
-        <w:t>[</w:t>
-      </w:r>
-      <w:proofErr w:type="gramStart"/>
-      <w:r>
-        <w:rPr>
-          <w:rFonts w:ascii="Arial" w:hAnsi="Arial"/>
-          <w:bCs/>
-          <w:sz w:val="20"/>
-        </w:rPr>
-        <w:t>U:ARTIKEL</w:t>
-      </w:r>
-      <w:proofErr w:type="gramEnd"/>
-      <w:r>
-        <w:rPr>
-          <w:rFonts w:ascii="Arial" w:hAnsi="Arial"/>
-          <w:bCs/>
-          <w:sz w:val="20"/>
-        </w:rPr>
-        <w:t xml:space="preserve">] sich vom </w:t>
+        <w:t xml:space="preserve">[U:ARTIKEL] sich vom </w:t>
       </w:r>
       <w:r>
         <w:rPr>
@@ -1961,15 +1913,7 @@
         <w:pStyle w:val="Diagnose"/>
       </w:pPr>
       <w:r>
-        <w:t>[</w:t>
-      </w:r>
-      <w:proofErr w:type="gramStart"/>
-      <w:r>
-        <w:t>USER:DIATAB</w:t>
-      </w:r>
-      <w:proofErr w:type="gramEnd"/>
-      <w:r>
-        <w:t>-DIA_DKEY]</w:t>
+        <w:t>[USER:DIATAB-DIA_DKEY]</w:t>
       </w:r>
       <w:r>
         <w:tab/>
@@ -2033,15 +1977,7 @@
         <w:pStyle w:val="Diagnose"/>
       </w:pPr>
       <w:r>
-        <w:t>[</w:t>
-      </w:r>
-      <w:proofErr w:type="gramStart"/>
-      <w:r>
-        <w:t>USER:PROCTAB</w:t>
-      </w:r>
-      <w:proofErr w:type="gramEnd"/>
-      <w:r>
-        <w:t>-</w:t>
+        <w:t>[USER:PROCTAB-</w:t>
       </w:r>
       <w:r>
         <w:t>PROC_</w:t>
@@ -2844,7 +2780,6 @@
           <w:rFonts w:ascii="Arial" w:hAnsi="Arial"/>
           <w:sz w:val="20"/>
         </w:rPr>
-        <w:lastRenderedPageBreak/>
         <w:t xml:space="preserve"> </w:t>
       </w:r>
     </w:p>
@@ -2925,6 +2860,7 @@
         <w:pStyle w:val="Unterschriften"/>
       </w:pPr>
       <w:r>
+        <w:lastRenderedPageBreak/>
         <w:tab/>
         <w:t>____________________________</w:t>
       </w:r>
@@ -5648,7 +5584,7 @@
               <w:szCs w:val="15"/>
               <w:lang w:eastAsia="de-DE"/>
             </w:rPr>
-            <w:t>20.08.2026</w:t>
+            <w:t>31.08.2026</w:t>
           </w:r>
           <w:r>
             <w:rPr>
@@ -5720,7 +5656,7 @@
               <w:szCs w:val="15"/>
               <w:lang w:eastAsia="de-DE"/>
             </w:rPr>
-            <w:t>3</w:t>
+            <w:t>4</w:t>
           </w:r>
           <w:r>
             <w:rPr>
@@ -5781,7 +5717,7 @@
               <w:szCs w:val="15"/>
               <w:lang w:eastAsia="de-DE"/>
             </w:rPr>
-            <w:t>3</w:t>
+            <w:t>4</w:t>
           </w:r>
           <w:r>
             <w:rPr>
@@ -6339,7 +6275,7 @@
               <w:szCs w:val="15"/>
               <w:lang w:eastAsia="de-DE"/>
             </w:rPr>
-            <w:t>20.08.2026</w:t>
+            <w:t>31.08.2026</w:t>
           </w:r>
           <w:r>
             <w:rPr>
@@ -6473,7 +6409,7 @@
               <w:szCs w:val="15"/>
               <w:lang w:eastAsia="de-DE"/>
             </w:rPr>
-            <w:t>3</w:t>
+            <w:t>4</w:t>
           </w:r>
           <w:r>
             <w:rPr>
@@ -6525,13 +6461,8 @@
     <w:pPr>
       <w:pStyle w:val="Kopfzeile"/>
     </w:pPr>
-    <w:proofErr w:type="gramStart"/>
     <w:r>
-      <w:t>Patient :</w:t>
-    </w:r>
-    <w:proofErr w:type="gramEnd"/>
-    <w:r>
-      <w:t xml:space="preserve"> [NPAT-VNAME] [NPAT-NAMZU] [NPAT-NNAME] geb. [NPAT-GBDAT]</w:t>
+      <w:t>Patient : [NPAT-VNAME] [NPAT-NAMZU] [NPAT-NNAME] geb. [NPAT-GBDAT]</w:t>
     </w:r>
     <w:r>
       <w:tab/>
@@ -6552,7 +6483,7 @@
       <w:pStyle w:val="SanaKliniken"/>
       <w:framePr w:w="3549" w:wrap="around" w:hAnchor="page" w:x="1436"/>
     </w:pPr>
-    <w:bookmarkStart w:id="2" w:name="_Hlk108784881"/>
+    <w:bookmarkStart w:id="3" w:name="_Hlk108784881"/>
     <w:r>
       <w:rPr>
         <w:noProof/>
@@ -6778,7 +6709,7 @@
         </mc:Fallback>
       </mc:AlternateContent>
     </w:r>
-    <w:bookmarkEnd w:id="2"/>
+    <w:bookmarkEnd w:id="3"/>
   </w:p>
 </w:hdr>
 </file>
@@ -6792,13 +6723,8 @@
         <w:bottom w:val="single" w:sz="4" w:space="1" w:color="auto"/>
       </w:pBdr>
     </w:pPr>
-    <w:proofErr w:type="gramStart"/>
     <w:r>
-      <w:t>Patient :</w:t>
-    </w:r>
-    <w:proofErr w:type="gramEnd"/>
-    <w:r>
-      <w:t xml:space="preserve"> [NPAT-VNAME] [NPAT-NAMZU] [NPAT-NNAME] geb. [NPAT-GBDAT]</w:t>
+      <w:t>Patient : [NPAT-VNAME] [NPAT-NAMZU] [NPAT-NNAME] geb. [NPAT-GBDAT]</w:t>
     </w:r>
     <w:r>
       <w:tab/>
@@ -6816,13 +6742,8 @@
         <w:bottom w:val="single" w:sz="4" w:space="1" w:color="auto"/>
       </w:pBdr>
     </w:pPr>
-    <w:proofErr w:type="gramStart"/>
     <w:r>
-      <w:t>Patient :</w:t>
-    </w:r>
-    <w:proofErr w:type="gramEnd"/>
-    <w:r>
-      <w:t xml:space="preserve"> [NPAT-VNAME] [NPAT-NAMZU] [NPAT-NNAME] geb. [NPAT-GBDAT]</w:t>
+      <w:t>Patient : [NPAT-VNAME] [NPAT-NAMZU] [NPAT-NNAME] geb. [NPAT-GBDAT]</w:t>
     </w:r>
     <w:r>
       <w:tab/>
@@ -7312,7 +7233,10 @@
   <w:style w:type="paragraph" w:default="1" w:styleId="Standard">
     <w:name w:val="Normal"/>
     <w:qFormat/>
-    <w:rsid w:val="00A95BC0"/>
+    <w:rsid w:val="00CD5BF8"/>
+    <w:pPr>
+      <w:spacing w:after="160" w:line="259" w:lineRule="auto"/>
+    </w:pPr>
     <w:rPr>
       <w:sz w:val="22"/>
       <w:szCs w:val="22"/>
@@ -7349,7 +7273,7 @@
     <w:uiPriority w:val="1"/>
     <w:semiHidden/>
     <w:unhideWhenUsed/>
-    <w:rsid w:val="00A95BC0"/>
+    <w:rsid w:val="00CD5BF8"/>
   </w:style>
   <w:style w:type="table" w:default="1" w:styleId="NormaleTabelle">
     <w:name w:val="Normal Table"/>
@@ -7371,7 +7295,7 @@
     <w:uiPriority w:val="99"/>
     <w:semiHidden/>
     <w:unhideWhenUsed/>
-    <w:rsid w:val="00A95BC0"/>
+    <w:rsid w:val="00CD5BF8"/>
   </w:style>
   <w:style w:type="character" w:customStyle="1" w:styleId="berschrift1Zchn">
     <w:name w:val="Überschrift 1 Zchn"/>

</xml_diff>

<commit_message>
Custom Ribbon - unsolved
Custom Ribbon build, but not showing up for other users.
</commit_message>
<xml_diff>
--- a/PaArztBrief_Version72.docx
+++ b/PaArztBrief_Version72.docx
@@ -701,33 +701,18 @@
         <w:fldChar w:fldCharType="separate"/>
       </w:r>
       <w:r>
-        <w:rPr>
-          <w:noProof/>
-        </w:rPr>
         <w:t> </w:t>
       </w:r>
       <w:r>
-        <w:rPr>
-          <w:noProof/>
-        </w:rPr>
         <w:t> </w:t>
       </w:r>
       <w:r>
-        <w:rPr>
-          <w:noProof/>
-        </w:rPr>
         <w:t> </w:t>
       </w:r>
       <w:r>
-        <w:rPr>
-          <w:noProof/>
-        </w:rPr>
         <w:t> </w:t>
       </w:r>
       <w:r>
-        <w:rPr>
-          <w:noProof/>
-        </w:rPr>
         <w:t> </w:t>
       </w:r>
       <w:r>
@@ -778,7 +763,6 @@
       <w:r>
         <w:rPr>
           <w:rFonts w:ascii="Arial" w:hAnsi="Arial"/>
-          <w:noProof/>
           <w:sz w:val="20"/>
         </w:rPr>
         <w:t> </w:t>
@@ -786,7 +770,6 @@
       <w:r>
         <w:rPr>
           <w:rFonts w:ascii="Arial" w:hAnsi="Arial"/>
-          <w:noProof/>
           <w:sz w:val="20"/>
         </w:rPr>
         <w:t> </w:t>
@@ -794,7 +777,6 @@
       <w:r>
         <w:rPr>
           <w:rFonts w:ascii="Arial" w:hAnsi="Arial"/>
-          <w:noProof/>
           <w:sz w:val="20"/>
         </w:rPr>
         <w:t> </w:t>
@@ -802,7 +784,6 @@
       <w:r>
         <w:rPr>
           <w:rFonts w:ascii="Arial" w:hAnsi="Arial"/>
-          <w:noProof/>
           <w:sz w:val="20"/>
         </w:rPr>
         <w:t> </w:t>
@@ -810,7 +791,6 @@
       <w:r>
         <w:rPr>
           <w:rFonts w:ascii="Arial" w:hAnsi="Arial"/>
-          <w:noProof/>
           <w:sz w:val="20"/>
         </w:rPr>
         <w:t> </w:t>
@@ -868,7 +848,6 @@
       <w:r>
         <w:rPr>
           <w:rFonts w:ascii="Arial" w:hAnsi="Arial"/>
-          <w:noProof/>
           <w:sz w:val="20"/>
         </w:rPr>
         <w:t> </w:t>
@@ -876,7 +855,6 @@
       <w:r>
         <w:rPr>
           <w:rFonts w:ascii="Arial" w:hAnsi="Arial"/>
-          <w:noProof/>
           <w:sz w:val="20"/>
         </w:rPr>
         <w:t> </w:t>
@@ -884,7 +862,6 @@
       <w:r>
         <w:rPr>
           <w:rFonts w:ascii="Arial" w:hAnsi="Arial"/>
-          <w:noProof/>
           <w:sz w:val="20"/>
         </w:rPr>
         <w:t> </w:t>
@@ -892,7 +869,6 @@
       <w:r>
         <w:rPr>
           <w:rFonts w:ascii="Arial" w:hAnsi="Arial"/>
-          <w:noProof/>
           <w:sz w:val="20"/>
         </w:rPr>
         <w:t> </w:t>
@@ -900,7 +876,6 @@
       <w:r>
         <w:rPr>
           <w:rFonts w:ascii="Arial" w:hAnsi="Arial"/>
-          <w:noProof/>
           <w:sz w:val="20"/>
         </w:rPr>
         <w:t> </w:t>
@@ -986,7 +961,6 @@
       <w:r>
         <w:rPr>
           <w:rFonts w:ascii="Arial" w:hAnsi="Arial"/>
-          <w:noProof/>
           <w:sz w:val="20"/>
         </w:rPr>
         <w:t> </w:t>
@@ -994,7 +968,6 @@
       <w:r>
         <w:rPr>
           <w:rFonts w:ascii="Arial" w:hAnsi="Arial"/>
-          <w:noProof/>
           <w:sz w:val="20"/>
         </w:rPr>
         <w:t> </w:t>
@@ -1002,7 +975,6 @@
       <w:r>
         <w:rPr>
           <w:rFonts w:ascii="Arial" w:hAnsi="Arial"/>
-          <w:noProof/>
           <w:sz w:val="20"/>
         </w:rPr>
         <w:t> </w:t>
@@ -1010,7 +982,6 @@
       <w:r>
         <w:rPr>
           <w:rFonts w:ascii="Arial" w:hAnsi="Arial"/>
-          <w:noProof/>
           <w:sz w:val="20"/>
         </w:rPr>
         <w:t> </w:t>
@@ -1018,7 +989,6 @@
       <w:r>
         <w:rPr>
           <w:rFonts w:ascii="Arial" w:hAnsi="Arial"/>
-          <w:noProof/>
           <w:sz w:val="20"/>
         </w:rPr>
         <w:t> </w:t>
@@ -1075,7 +1045,6 @@
       <w:r>
         <w:rPr>
           <w:rFonts w:ascii="Arial" w:hAnsi="Arial"/>
-          <w:noProof/>
           <w:sz w:val="20"/>
         </w:rPr>
         <w:t> </w:t>
@@ -1083,7 +1052,6 @@
       <w:r>
         <w:rPr>
           <w:rFonts w:ascii="Arial" w:hAnsi="Arial"/>
-          <w:noProof/>
           <w:sz w:val="20"/>
         </w:rPr>
         <w:t> </w:t>
@@ -1091,7 +1059,6 @@
       <w:r>
         <w:rPr>
           <w:rFonts w:ascii="Arial" w:hAnsi="Arial"/>
-          <w:noProof/>
           <w:sz w:val="20"/>
         </w:rPr>
         <w:t> </w:t>
@@ -1099,7 +1066,6 @@
       <w:r>
         <w:rPr>
           <w:rFonts w:ascii="Arial" w:hAnsi="Arial"/>
-          <w:noProof/>
           <w:sz w:val="20"/>
         </w:rPr>
         <w:t> </w:t>
@@ -1107,7 +1073,6 @@
       <w:r>
         <w:rPr>
           <w:rFonts w:ascii="Arial" w:hAnsi="Arial"/>
-          <w:noProof/>
           <w:sz w:val="20"/>
         </w:rPr>
         <w:t> </w:t>
@@ -1213,42 +1178,9 @@
       <w:r>
         <w:rPr>
           <w:rFonts w:ascii="Arial" w:hAnsi="Arial"/>
-          <w:noProof/>
-          <w:sz w:val="20"/>
-        </w:rPr>
-        <w:t> </w:t>
-      </w:r>
-      <w:r>
-        <w:rPr>
-          <w:rFonts w:ascii="Arial" w:hAnsi="Arial"/>
-          <w:noProof/>
-          <w:sz w:val="20"/>
-        </w:rPr>
-        <w:t> </w:t>
-      </w:r>
-      <w:r>
-        <w:rPr>
-          <w:rFonts w:ascii="Arial" w:hAnsi="Arial"/>
-          <w:noProof/>
-          <w:sz w:val="20"/>
-        </w:rPr>
-        <w:t> </w:t>
-      </w:r>
-      <w:r>
-        <w:rPr>
-          <w:rFonts w:ascii="Arial" w:hAnsi="Arial"/>
-          <w:noProof/>
-          <w:sz w:val="20"/>
-        </w:rPr>
-        <w:t> </w:t>
-      </w:r>
-      <w:r>
-        <w:rPr>
-          <w:rFonts w:ascii="Arial" w:hAnsi="Arial"/>
-          <w:noProof/>
-          <w:sz w:val="20"/>
-        </w:rPr>
-        <w:t> </w:t>
+          <w:sz w:val="20"/>
+        </w:rPr>
+        <w:t xml:space="preserve">Erstschriftlich an : </w:t>
       </w:r>
       <w:r>
         <w:rPr>
@@ -1303,42 +1235,9 @@
       <w:r>
         <w:rPr>
           <w:rFonts w:ascii="Arial" w:hAnsi="Arial"/>
-          <w:noProof/>
-          <w:sz w:val="20"/>
-        </w:rPr>
-        <w:t> </w:t>
-      </w:r>
-      <w:r>
-        <w:rPr>
-          <w:rFonts w:ascii="Arial" w:hAnsi="Arial"/>
-          <w:noProof/>
-          <w:sz w:val="20"/>
-        </w:rPr>
-        <w:t> </w:t>
-      </w:r>
-      <w:r>
-        <w:rPr>
-          <w:rFonts w:ascii="Arial" w:hAnsi="Arial"/>
-          <w:noProof/>
-          <w:sz w:val="20"/>
-        </w:rPr>
-        <w:t> </w:t>
-      </w:r>
-      <w:r>
-        <w:rPr>
-          <w:rFonts w:ascii="Arial" w:hAnsi="Arial"/>
-          <w:noProof/>
-          <w:sz w:val="20"/>
-        </w:rPr>
-        <w:t> </w:t>
-      </w:r>
-      <w:r>
-        <w:rPr>
-          <w:rFonts w:ascii="Arial" w:hAnsi="Arial"/>
-          <w:noProof/>
-          <w:sz w:val="20"/>
-        </w:rPr>
-        <w:t> </w:t>
+          <w:sz w:val="20"/>
+        </w:rPr>
+        <w:t>An die weiterbehandelnde Kollegin/den weiterbehandelnden Kollegen</w:t>
       </w:r>
       <w:r>
         <w:rPr>
@@ -1393,42 +1292,9 @@
       <w:r>
         <w:rPr>
           <w:rFonts w:ascii="Arial" w:hAnsi="Arial"/>
-          <w:noProof/>
-          <w:sz w:val="20"/>
-        </w:rPr>
-        <w:t> </w:t>
-      </w:r>
-      <w:r>
-        <w:rPr>
-          <w:rFonts w:ascii="Arial" w:hAnsi="Arial"/>
-          <w:noProof/>
-          <w:sz w:val="20"/>
-        </w:rPr>
-        <w:t> </w:t>
-      </w:r>
-      <w:r>
-        <w:rPr>
-          <w:rFonts w:ascii="Arial" w:hAnsi="Arial"/>
-          <w:noProof/>
-          <w:sz w:val="20"/>
-        </w:rPr>
-        <w:t> </w:t>
-      </w:r>
-      <w:r>
-        <w:rPr>
-          <w:rFonts w:ascii="Arial" w:hAnsi="Arial"/>
-          <w:noProof/>
-          <w:sz w:val="20"/>
-        </w:rPr>
-        <w:t> </w:t>
-      </w:r>
-      <w:r>
-        <w:rPr>
-          <w:rFonts w:ascii="Arial" w:hAnsi="Arial"/>
-          <w:noProof/>
-          <w:sz w:val="20"/>
-        </w:rPr>
-        <w:t> </w:t>
+          <w:sz w:val="20"/>
+        </w:rPr>
+        <w:t xml:space="preserve">Nachrichtlich an : </w:t>
       </w:r>
       <w:r>
         <w:rPr>
@@ -1484,7 +1350,6 @@
       <w:r>
         <w:rPr>
           <w:rFonts w:ascii="Arial" w:hAnsi="Arial"/>
-          <w:noProof/>
           <w:sz w:val="20"/>
         </w:rPr>
         <w:t> </w:t>
@@ -1492,7 +1357,6 @@
       <w:r>
         <w:rPr>
           <w:rFonts w:ascii="Arial" w:hAnsi="Arial"/>
-          <w:noProof/>
           <w:sz w:val="20"/>
         </w:rPr>
         <w:t> </w:t>
@@ -1500,7 +1364,6 @@
       <w:r>
         <w:rPr>
           <w:rFonts w:ascii="Arial" w:hAnsi="Arial"/>
-          <w:noProof/>
           <w:sz w:val="20"/>
         </w:rPr>
         <w:t> </w:t>
@@ -1508,7 +1371,6 @@
       <w:r>
         <w:rPr>
           <w:rFonts w:ascii="Arial" w:hAnsi="Arial"/>
-          <w:noProof/>
           <w:sz w:val="20"/>
         </w:rPr>
         <w:t> </w:t>
@@ -1516,7 +1378,6 @@
       <w:r>
         <w:rPr>
           <w:rFonts w:ascii="Arial" w:hAnsi="Arial"/>
-          <w:noProof/>
           <w:sz w:val="20"/>
         </w:rPr>
         <w:t> </w:t>
@@ -1575,7 +1436,6 @@
       <w:r>
         <w:rPr>
           <w:rFonts w:ascii="Arial" w:hAnsi="Arial"/>
-          <w:noProof/>
           <w:sz w:val="20"/>
         </w:rPr>
         <w:t> </w:t>
@@ -1583,7 +1443,6 @@
       <w:r>
         <w:rPr>
           <w:rFonts w:ascii="Arial" w:hAnsi="Arial"/>
-          <w:noProof/>
           <w:sz w:val="20"/>
         </w:rPr>
         <w:t> </w:t>
@@ -1591,7 +1450,6 @@
       <w:r>
         <w:rPr>
           <w:rFonts w:ascii="Arial" w:hAnsi="Arial"/>
-          <w:noProof/>
           <w:sz w:val="20"/>
         </w:rPr>
         <w:t> </w:t>
@@ -1599,7 +1457,6 @@
       <w:r>
         <w:rPr>
           <w:rFonts w:ascii="Arial" w:hAnsi="Arial"/>
-          <w:noProof/>
           <w:sz w:val="20"/>
         </w:rPr>
         <w:t> </w:t>
@@ -1607,7 +1464,6 @@
       <w:r>
         <w:rPr>
           <w:rFonts w:ascii="Arial" w:hAnsi="Arial"/>
-          <w:noProof/>
           <w:sz w:val="20"/>
         </w:rPr>
         <w:t> </w:t>
@@ -1682,7 +1538,6 @@
       <w:r>
         <w:rPr>
           <w:rFonts w:ascii="Arial" w:hAnsi="Arial"/>
-          <w:noProof/>
           <w:sz w:val="20"/>
         </w:rPr>
         <w:t> </w:t>
@@ -1690,7 +1545,6 @@
       <w:r>
         <w:rPr>
           <w:rFonts w:ascii="Arial" w:hAnsi="Arial"/>
-          <w:noProof/>
           <w:sz w:val="20"/>
         </w:rPr>
         <w:t> </w:t>
@@ -1698,7 +1552,6 @@
       <w:r>
         <w:rPr>
           <w:rFonts w:ascii="Arial" w:hAnsi="Arial"/>
-          <w:noProof/>
           <w:sz w:val="20"/>
         </w:rPr>
         <w:t> </w:t>
@@ -1706,7 +1559,6 @@
       <w:r>
         <w:rPr>
           <w:rFonts w:ascii="Arial" w:hAnsi="Arial"/>
-          <w:noProof/>
           <w:sz w:val="20"/>
         </w:rPr>
         <w:t> </w:t>
@@ -1714,7 +1566,6 @@
       <w:r>
         <w:rPr>
           <w:rFonts w:ascii="Arial" w:hAnsi="Arial"/>
-          <w:noProof/>
           <w:sz w:val="20"/>
         </w:rPr>
         <w:t> </w:t>
@@ -1864,7 +1715,25 @@
           <w:bCs/>
           <w:sz w:val="20"/>
         </w:rPr>
-        <w:t xml:space="preserve">[U:ARTIKEL] sich vom </w:t>
+        <w:t>[</w:t>
+      </w:r>
+      <w:proofErr w:type="gramStart"/>
+      <w:r>
+        <w:rPr>
+          <w:rFonts w:ascii="Arial" w:hAnsi="Arial"/>
+          <w:bCs/>
+          <w:sz w:val="20"/>
+        </w:rPr>
+        <w:t>U:ARTIKEL</w:t>
+      </w:r>
+      <w:proofErr w:type="gramEnd"/>
+      <w:r>
+        <w:rPr>
+          <w:rFonts w:ascii="Arial" w:hAnsi="Arial"/>
+          <w:bCs/>
+          <w:sz w:val="20"/>
+        </w:rPr>
+        <w:t xml:space="preserve">] sich vom </w:t>
       </w:r>
       <w:r>
         <w:rPr>
@@ -1913,7 +1782,15 @@
         <w:pStyle w:val="Diagnose"/>
       </w:pPr>
       <w:r>
-        <w:t>[USER:DIATAB-DIA_DKEY]</w:t>
+        <w:t>[</w:t>
+      </w:r>
+      <w:proofErr w:type="gramStart"/>
+      <w:r>
+        <w:t>USER:DIATAB</w:t>
+      </w:r>
+      <w:proofErr w:type="gramEnd"/>
+      <w:r>
+        <w:t>-DIA_DKEY]</w:t>
       </w:r>
       <w:r>
         <w:tab/>
@@ -1977,7 +1854,15 @@
         <w:pStyle w:val="Diagnose"/>
       </w:pPr>
       <w:r>
-        <w:t>[USER:PROCTAB-</w:t>
+        <w:t>[</w:t>
+      </w:r>
+      <w:proofErr w:type="gramStart"/>
+      <w:r>
+        <w:t>USER:PROCTAB</w:t>
+      </w:r>
+      <w:proofErr w:type="gramEnd"/>
+      <w:r>
+        <w:t>-</w:t>
       </w:r>
       <w:r>
         <w:t>PROC_</w:t>
@@ -5584,7 +5469,7 @@
               <w:szCs w:val="15"/>
               <w:lang w:eastAsia="de-DE"/>
             </w:rPr>
-            <w:t>31.08.2026</w:t>
+            <w:t>03.09.2026</w:t>
           </w:r>
           <w:r>
             <w:rPr>
@@ -5656,7 +5541,7 @@
               <w:szCs w:val="15"/>
               <w:lang w:eastAsia="de-DE"/>
             </w:rPr>
-            <w:t>4</w:t>
+            <w:t>2</w:t>
           </w:r>
           <w:r>
             <w:rPr>
@@ -6275,7 +6160,7 @@
               <w:szCs w:val="15"/>
               <w:lang w:eastAsia="de-DE"/>
             </w:rPr>
-            <w:t>31.08.2026</w:t>
+            <w:t>03.09.2026</w:t>
           </w:r>
           <w:r>
             <w:rPr>
@@ -6461,8 +6346,13 @@
     <w:pPr>
       <w:pStyle w:val="Kopfzeile"/>
     </w:pPr>
+    <w:proofErr w:type="gramStart"/>
     <w:r>
-      <w:t>Patient : [NPAT-VNAME] [NPAT-NAMZU] [NPAT-NNAME] geb. [NPAT-GBDAT]</w:t>
+      <w:t>Patient :</w:t>
+    </w:r>
+    <w:proofErr w:type="gramEnd"/>
+    <w:r>
+      <w:t xml:space="preserve"> [NPAT-VNAME] [NPAT-NAMZU] [NPAT-NNAME] geb. [NPAT-GBDAT]</w:t>
     </w:r>
     <w:r>
       <w:tab/>
@@ -6723,8 +6613,13 @@
         <w:bottom w:val="single" w:sz="4" w:space="1" w:color="auto"/>
       </w:pBdr>
     </w:pPr>
+    <w:proofErr w:type="gramStart"/>
     <w:r>
-      <w:t>Patient : [NPAT-VNAME] [NPAT-NAMZU] [NPAT-NNAME] geb. [NPAT-GBDAT]</w:t>
+      <w:t>Patient :</w:t>
+    </w:r>
+    <w:proofErr w:type="gramEnd"/>
+    <w:r>
+      <w:t xml:space="preserve"> [NPAT-VNAME] [NPAT-NAMZU] [NPAT-NNAME] geb. [NPAT-GBDAT]</w:t>
     </w:r>
     <w:r>
       <w:tab/>
@@ -6742,8 +6637,13 @@
         <w:bottom w:val="single" w:sz="4" w:space="1" w:color="auto"/>
       </w:pBdr>
     </w:pPr>
+    <w:proofErr w:type="gramStart"/>
     <w:r>
-      <w:t>Patient : [NPAT-VNAME] [NPAT-NAMZU] [NPAT-NNAME] geb. [NPAT-GBDAT]</w:t>
+      <w:t>Patient :</w:t>
+    </w:r>
+    <w:proofErr w:type="gramEnd"/>
+    <w:r>
+      <w:t xml:space="preserve"> [NPAT-VNAME] [NPAT-NAMZU] [NPAT-NNAME] geb. [NPAT-GBDAT]</w:t>
     </w:r>
     <w:r>
       <w:tab/>
@@ -7233,7 +7133,7 @@
   <w:style w:type="paragraph" w:default="1" w:styleId="Standard">
     <w:name w:val="Normal"/>
     <w:qFormat/>
-    <w:rsid w:val="00CD5BF8"/>
+    <w:rsid w:val="00EB462A"/>
     <w:pPr>
       <w:spacing w:after="160" w:line="259" w:lineRule="auto"/>
     </w:pPr>
@@ -7273,7 +7173,7 @@
     <w:uiPriority w:val="1"/>
     <w:semiHidden/>
     <w:unhideWhenUsed/>
-    <w:rsid w:val="00CD5BF8"/>
+    <w:rsid w:val="00EB462A"/>
   </w:style>
   <w:style w:type="table" w:default="1" w:styleId="NormaleTabelle">
     <w:name w:val="Normal Table"/>
@@ -7295,7 +7195,7 @@
     <w:uiPriority w:val="99"/>
     <w:semiHidden/>
     <w:unhideWhenUsed/>
-    <w:rsid w:val="00CD5BF8"/>
+    <w:rsid w:val="00EB462A"/>
   </w:style>
   <w:style w:type="character" w:customStyle="1" w:styleId="berschrift1Zchn">
     <w:name w:val="Überschrift 1 Zchn"/>

</xml_diff>